<commit_message>
Simplifica a questão 4 do relatório da Fase 2
Reduz comentários nos scripts PySpark e organiza o código em
blocos menores: configuração, consulta 1, consulta 2 e consulta 3.

Co-authored-by: Walter Filipe Zanchet <waltfilipe@users.noreply.github.com>
</commit_message>
<xml_diff>
--- a/Fase_2_Relatorio_Walter_Zanchet.docx
+++ b/Fase_2_Relatorio_Walter_Zanchet.docx
@@ -60,7 +60,7 @@
     </w:p>
     <w:p>
       <w:r>
-        <w:t>Este relatório descreve a integração técnica Oracle–Spark, define três consultas analíticas sobre a base de voos e apresenta os scripts PySpark correspondentes, comentados linha a linha.</w:t>
+        <w:t>Este relatório descreve a integração técnica Oracle–Spark, define três consultas analíticas sobre a base de voos e apresenta os scripts PySpark correspondentes.</w:t>
       </w:r>
     </w:p>
     <w:p>
@@ -259,7 +259,7 @@
         <w:pStyle w:val="ListBullet"/>
       </w:pPr>
       <w:r>
-        <w:t>O driver Oracle JDBC (ojdbc8.jar ou ojdbc11.jar) é adicionado ao classpath do Spark.</w:t>
+        <w:t>O driver Oracle JDBC (ojdbc8.jar) é adicionado ao classpath do Spark.</w:t>
       </w:r>
     </w:p>
     <w:p>
@@ -267,15 +267,7 @@
         <w:pStyle w:val="ListBullet"/>
       </w:pPr>
       <w:r>
-        <w:t>O Spark abre conexões JDBC paralelas (particionamento opcional por coluna numérica) e lê cada tabela como um DataFrame.</w:t>
-      </w:r>
-    </w:p>
-    <w:p>
-      <w:pPr>
-        <w:pStyle w:val="ListBullet"/>
-      </w:pPr>
-      <w:r>
-        <w:t>As tabelas são registradas como views temporárias para consultas em Spark SQL.</w:t>
+        <w:t>O Spark lê cada tabela como um DataFrame e registra views temporárias para Spark SQL.</w:t>
       </w:r>
     </w:p>
     <w:p>
@@ -294,12 +286,10 @@
         </w:rPr>
         <w:t>jdbc_url = "jdbc:oracle:thin:@localhost:1521/XEPDB1"</w:t>
         <w:br/>
-        <w:t># Alternativa com SID: "jdbc:oracle:thin:@localhost:1521:XE"</w:t>
-        <w:br/>
         <w:br/>
         <w:t>connection_properties = {</w:t>
         <w:br/>
-        <w:t xml:space="preserve">    "user": "system",           # ou o usuário do seu schema</w:t>
+        <w:t xml:space="preserve">    "user": "system",</w:t>
         <w:br/>
         <w:t xml:space="preserve">    "password": "&lt;sua_senha&gt;",</w:t>
         <w:br/>
@@ -385,8 +375,6 @@
         <w:br/>
         <w:t>types     = ler_tabela_oracle("AIR_AIRPLANE_TYPES")</w:t>
         <w:br/>
-        <w:br/>
-        <w:t># Registro como views para Spark SQL</w:t>
         <w:br/>
         <w:t>flights.createOrReplaceTempView("flights")</w:t>
         <w:br/>
@@ -484,7 +472,7 @@
           </w:tcPr>
           <w:p>
             <w:r>
-              <w:t>DEPARTURE (TIMESTAMP Oracle) é mapeado automaticamente; funções como dayofweek() e month() substituem TO_CHAR/EXTRACT do Oracle</w:t>
+              <w:t>DEPARTURE é mapeado automaticamente; dayofweek() e month() substituem TO_CHAR/EXTRACT</w:t>
             </w:r>
           </w:p>
         </w:tc>
@@ -506,7 +494,7 @@
           </w:tcPr>
           <w:p>
             <w:r>
-              <w:t>Equivalentes aos JOINs SQL da Fase 1, executados pelo otimizador Catalyst do Spark</w:t>
+              <w:t>Equivalentes aos JOINs SQL da Fase 1, executados pelo Catalyst do Spark</w:t>
             </w:r>
           </w:p>
         </w:tc>
@@ -528,7 +516,7 @@
           </w:tcPr>
           <w:p>
             <w:r>
-              <w:t>df.cache() em tabelas reutilizadas em múltiplas consultas reduz leituras JDBC repetidas</w:t>
+              <w:t>df.cache() reduz leituras JDBC repetidas</w:t>
             </w:r>
           </w:p>
         </w:tc>
@@ -549,8 +537,6 @@
           <w:sz w:val="18"/>
         </w:rPr>
         <w:t>pip install pyspark</w:t>
-        <w:br/>
-        <w:t># Driver Oracle: ojdbc8.jar (Maven: com.oracle.database.jdbc:ojdbc8)</w:t>
       </w:r>
     </w:p>
     <w:p>
@@ -579,7 +565,7 @@
         <w:pStyle w:val="ListBullet"/>
       </w:pPr>
       <w:r>
-        <w:t>Objetivo: Listar companhia aérea, identificador da aeronave, tipo de aeronave e quantidade de voos operados cuja origem e destino estão no país BRAZIL.</w:t>
+        <w:t>Objetivo: Listar companhia aérea, identificador da aeronave, tipo de aeronave e quantidade de voos cuja origem e destino estão no país BRAZIL.</w:t>
       </w:r>
     </w:p>
     <w:p>
@@ -587,7 +573,7 @@
         <w:pStyle w:val="ListBullet"/>
       </w:pPr>
       <w:r>
-        <w:t>Relevância: Continuidade direta da Consulta (i) da Fase 1; valida a leitura JDBC de cinco tabelas e agregações com GROUP BY.</w:t>
+        <w:t>Relevância: Continuidade da Consulta (i) da Fase 1.</w:t>
       </w:r>
     </w:p>
     <w:p>
@@ -595,7 +581,7 @@
         <w:pStyle w:val="ListBullet"/>
       </w:pPr>
       <w:r>
-        <w:t>Resultado esperado: 8 linhas (conforme gabarito da Fase 1).</w:t>
+        <w:t>Resultado esperado: 8 linhas.</w:t>
       </w:r>
     </w:p>
     <w:p>
@@ -603,7 +589,7 @@
         <w:pStyle w:val="ListBullet"/>
       </w:pPr>
       <w:r>
-        <w:t>Capacidades Spark demonstradas: leitura JDBC multi-tabela, JOIN, filter, groupBy, count, orderBy.</w:t>
+        <w:t>Capacidades Spark: JOIN, groupBy, count, orderBy.</w:t>
       </w:r>
     </w:p>
     <w:p>
@@ -619,7 +605,7 @@
         <w:pStyle w:val="ListBullet"/>
       </w:pPr>
       <w:r>
-        <w:t>Objetivo: Listar companhia aérea, data e hora de partida dos voos com destino à cidade NEW YORK, que partem às terças, quartas ou quintas-feiras, no mês de aniversário do estudante (junho).</w:t>
+        <w:t>Objetivo: Listar companhia aérea, data e hora de partida dos voos com destino NEW YORK, às terças, quartas ou quintas, no mês de junho.</w:t>
       </w:r>
     </w:p>
     <w:p>
@@ -627,7 +613,7 @@
         <w:pStyle w:val="ListBullet"/>
       </w:pPr>
       <w:r>
-        <w:t>Relevância: Equivalente à Consulta (ii) da Fase 1; exercita filtros de data no Spark (dayofweek, month).</w:t>
+        <w:t>Relevância: Equivalente à Consulta (ii) da Fase 1.</w:t>
       </w:r>
     </w:p>
     <w:p>
@@ -635,7 +621,7 @@
         <w:pStyle w:val="ListBullet"/>
       </w:pPr>
       <w:r>
-        <w:t>Resultado esperado: 1 linha (março de 2020 no gabarito; com mês 6 pode variar — ajuste conforme seus dados).</w:t>
+        <w:t>Resultado esperado: 1 linha (ajustar o mês se necessário).</w:t>
       </w:r>
     </w:p>
     <w:p>
@@ -643,7 +629,7 @@
         <w:pStyle w:val="ListBullet"/>
       </w:pPr>
       <w:r>
-        <w:t>Capacidades Spark demonstradas: JOIN, filtros compostos, funções de data do Spark SQL.</w:t>
+        <w:t>Capacidades Spark: JOIN, filtros de data (dayofweek, month).</w:t>
       </w:r>
     </w:p>
     <w:p>
@@ -659,7 +645,7 @@
         <w:pStyle w:val="ListBullet"/>
       </w:pPr>
       <w:r>
-        <w:t>Objetivo: Identificar as 5 combinações origem–destino (aeroportos em países diferentes) com maior número de voos, exibindo país de origem, país de destino e total de voos.</w:t>
+        <w:t>Objetivo: Identificar as 5 rotas internacionais (origem e destino em países diferentes) com maior número de voos.</w:t>
       </w:r>
     </w:p>
     <w:p>
@@ -667,7 +653,7 @@
         <w:pStyle w:val="ListBullet"/>
       </w:pPr>
       <w:r>
-        <w:t>Relevância: Consulta nova, típica de análise operacional; exige self-join em AIR_AIRPORTS_GEO e agregação com ordenação.</w:t>
+        <w:t>Relevância: Análise operacional com self-join e ranking.</w:t>
       </w:r>
     </w:p>
     <w:p>
@@ -675,7 +661,7 @@
         <w:pStyle w:val="ListBullet"/>
       </w:pPr>
       <w:r>
-        <w:t>Capacidades Spark demonstradas: self-join, filter com desigualdade, groupBy, count, orderBy desc, limit — padrão de ranking analítico em processamento distribuído.</w:t>
+        <w:t>Capacidades Spark: self-join, groupBy, orderBy desc, limit.</w:t>
       </w:r>
     </w:p>
     <w:p>
@@ -688,13 +674,7 @@
     </w:p>
     <w:p>
       <w:r>
-        <w:rPr>
-          <w:b/>
-        </w:rPr>
-        <w:t xml:space="preserve">Nota: </w:t>
-      </w:r>
-      <w:r>
-        <w:t>O enunciado cita "(Fase 1)", mas no contexto da Fase 2 os scripts abaixo são em PySpark/Spark SQL, equivalentes às consultas definidas no item 3.</w:t>
+        <w:t>Abaixo estão os scripts PySpark para executar as três consultas definidas no item 3. Primeiro, configura-se a conexão com o Oracle e carregam-se as tabelas necessárias.</w:t>
       </w:r>
     </w:p>
     <w:p>
@@ -702,89 +682,50 @@
         <w:pStyle w:val="Heading2"/>
       </w:pPr>
       <w:r>
-        <w:t>4.1 Script completo de integração e consultas</w:t>
+        <w:t>4.1 Configuração e carga dos dados</w:t>
       </w:r>
     </w:p>
     <w:p>
       <w:r>
         <w:rPr>
           <w:rFonts w:ascii="Courier New" w:hAnsi="Courier New"/>
-          <w:sz w:val="16"/>
+          <w:sz w:val="18"/>
         </w:rPr>
-        <w:t># =============================================================================</w:t>
-        <w:br/>
-        <w:t># FASE 2 - Integração Oracle (Fase 1) com Apache Spark</w:t>
-        <w:br/>
-        <w:t># Disciplina: Infraestrutura para Gestão de Dados - PUCRS</w:t>
-        <w:br/>
-        <w:t># Autor: Walter Filipe Bortoleto Zanchet</w:t>
-        <w:br/>
-        <w:t># =============================================================================</w:t>
+        <w:t>from pyspark.sql import SparkSession</w:t>
         <w:br/>
         <w:br/>
-        <w:t>from pyspark.sql import SparkSession</w:t>
+        <w:t>spark = SparkSession.builder \</w:t>
         <w:br/>
-        <w:t>from pyspark.sql.functions import col, count, dayofweek, month</w:t>
+        <w:t xml:space="preserve">    .appName("Fase2_AirlineAnalytics") \</w:t>
         <w:br/>
-        <w:br/>
-        <w:t># -----------------------------------------------------------------------------</w:t>
-        <w:br/>
-        <w:t># 1. INICIALIZAÇÃO DO SPARK</w:t>
-        <w:br/>
-        <w:t># -----------------------------------------------------------------------------</w:t>
-        <w:br/>
-        <w:t># Cria a sessão Spark e registra o driver JDBC do Oracle no classpath.</w:t>
-        <w:br/>
-        <w:t>spark = (</w:t>
-        <w:br/>
-        <w:t xml:space="preserve">    SparkSession.builder</w:t>
-        <w:br/>
-        <w:t xml:space="preserve">    .appName("Fase2_AirlineAnalytics")</w:t>
-        <w:br/>
-        <w:t xml:space="preserve">    .config("spark.jars", "/workspaces/OtimizacaoConsultas/lib/ojdbc8.jar")</w:t>
+        <w:t xml:space="preserve">    .config("spark.jars", "/workspaces/OtimizacaoConsultas/lib/ojdbc8.jar") \</w:t>
         <w:br/>
         <w:t xml:space="preserve">    .getOrCreate()</w:t>
         <w:br/>
-        <w:t>)</w:t>
-        <w:br/>
-        <w:br/>
-        <w:t># Parâmetros de conexão JDBC com o Oracle da Fase 1 (container Docker)</w:t>
         <w:br/>
         <w:t>JDBC_URL = "jdbc:oracle:thin:@localhost:1521/XEPDB1"</w:t>
         <w:br/>
         <w:t>DB_USER = "system"</w:t>
         <w:br/>
-        <w:t>DB_PASS = "sua_senha"  # substituir pela senha configurada no docker-compose</w:t>
+        <w:t>DB_PASS = "sua_senha"</w:t>
         <w:br/>
         <w:br/>
         <w:t>def carregar_tabela(nome):</w:t>
         <w:br/>
-        <w:t xml:space="preserve">    """Lê uma tabela Oracle via JDBC e retorna um DataFrame Spark."""</w:t>
+        <w:t xml:space="preserve">    return spark.read.format("jdbc") \</w:t>
         <w:br/>
-        <w:t xml:space="preserve">    return (</w:t>
+        <w:t xml:space="preserve">        .option("url", JDBC_URL) \</w:t>
         <w:br/>
-        <w:t xml:space="preserve">        spark.read.format("jdbc")</w:t>
+        <w:t xml:space="preserve">        .option("dbtable", nome) \</w:t>
         <w:br/>
-        <w:t xml:space="preserve">        .option("url", JDBC_URL)</w:t>
+        <w:t xml:space="preserve">        .option("user", DB_USER) \</w:t>
         <w:br/>
-        <w:t xml:space="preserve">        .option("dbtable", nome)</w:t>
+        <w:t xml:space="preserve">        .option("password", DB_PASS) \</w:t>
         <w:br/>
-        <w:t xml:space="preserve">        .option("user", DB_USER)</w:t>
-        <w:br/>
-        <w:t xml:space="preserve">        .option("password", DB_PASS)</w:t>
-        <w:br/>
-        <w:t xml:space="preserve">        .option("driver", "oracle.jdbc.OracleDriver")</w:t>
+        <w:t xml:space="preserve">        .option("driver", "oracle.jdbc.OracleDriver") \</w:t>
         <w:br/>
         <w:t xml:space="preserve">        .load()</w:t>
         <w:br/>
-        <w:t xml:space="preserve">    )</w:t>
-        <w:br/>
-        <w:br/>
-        <w:t># -----------------------------------------------------------------------------</w:t>
-        <w:br/>
-        <w:t># 2. CARGA DAS TABELAS E REGISTRO COMO VIEWS TEMPORÁRIAS</w:t>
-        <w:br/>
-        <w:t># -----------------------------------------------------------------------------</w:t>
         <w:br/>
         <w:t>flights   = carregar_tabela("AIR_FLIGHTS")</w:t>
         <w:br/>
@@ -806,37 +747,32 @@
         <w:t>airplanes.createOrReplaceTempView("p")</w:t>
         <w:br/>
         <w:t>types.createOrReplaceTempView("t")</w:t>
-        <w:br/>
-        <w:br/>
-        <w:t># Cache da tabela de voos (reutilizada nas 3 consultas)</w:t>
-        <w:br/>
-        <w:t>flights.cache()</w:t>
-        <w:br/>
-        <w:br/>
-        <w:t># =============================================================================</w:t>
-        <w:br/>
-        <w:t># CONSULTA 1: Voos com origem e destino no Brasil, por companhia/aeronave/tipo</w:t>
-        <w:br/>
-        <w:t># =============================================================================</w:t>
-        <w:br/>
-        <w:t># Equivalente à consulta (i) da Fase 1.</w:t>
-        <w:br/>
-        <w:t># JOINs: voos -&gt; geo origem/destino (BRAZIL) -&gt; companhia -&gt; aeronave -&gt; tipo.</w:t>
-        <w:br/>
-        <w:t># Agregação: COUNT de voos agrupado por companhia, aeronave e tipo.</w:t>
-        <w:br/>
-        <w:br/>
+      </w:r>
+    </w:p>
+    <w:p>
+      <w:pPr>
+        <w:pStyle w:val="Heading2"/>
+      </w:pPr>
+      <w:r>
+        <w:t>4.2 Consulta 1 — Voos no Brasil</w:t>
+      </w:r>
+    </w:p>
+    <w:p>
+      <w:r>
+        <w:t>Conta voos com origem e destino no Brasil, agrupados por companhia, aeronave e tipo.</w:t>
+      </w:r>
+    </w:p>
+    <w:p>
+      <w:r>
+        <w:rPr>
+          <w:rFonts w:ascii="Courier New" w:hAnsi="Courier New"/>
+          <w:sz w:val="18"/>
+        </w:rPr>
         <w:t>consulta1 = spark.sql("""</w:t>
         <w:br/>
-        <w:t xml:space="preserve">    SELECT</w:t>
+        <w:t xml:space="preserve">    SELECT a.AIRLINE_NAME, p.AIRPLANE_ID, t.NAME AS TIPO_AERONAVE,</w:t>
         <w:br/>
-        <w:t xml:space="preserve">        a.AIRLINE_NAME,</w:t>
-        <w:br/>
-        <w:t xml:space="preserve">        p.AIRPLANE_ID,</w:t>
-        <w:br/>
-        <w:t xml:space="preserve">        t.NAME AS TIPO_AERONAVE,</w:t>
-        <w:br/>
-        <w:t xml:space="preserve">        COUNT(f.FLIGHT_ID) AS NUM_VOOS</w:t>
+        <w:t xml:space="preserve">           COUNT(f.FLIGHT_ID) AS NUM_VOOS</w:t>
         <w:br/>
         <w:t xml:space="preserve">    FROM f</w:t>
         <w:br/>
@@ -844,11 +780,11 @@
         <w:br/>
         <w:t xml:space="preserve">    JOIN g g2 ON f.TO_AIRPORT_ID   = g2.AIRPORT_ID AND g2.COUNTRY = 'BRAZIL'</w:t>
         <w:br/>
-        <w:t xml:space="preserve">    JOIN a      ON f.AIRLINE_ID     = a.AIRLINE_ID</w:t>
+        <w:t xml:space="preserve">    JOIN a ON f.AIRLINE_ID = a.AIRLINE_ID</w:t>
         <w:br/>
-        <w:t xml:space="preserve">    JOIN p      ON a.AIRLINE_ID     = p.AIRLINE_ID</w:t>
+        <w:t xml:space="preserve">    JOIN p ON a.AIRLINE_ID = p.AIRLINE_ID</w:t>
         <w:br/>
-        <w:t xml:space="preserve">    JOIN t      ON p.AIRPLANE_TYPE_ID = t.AIRPLANE_TYPE_ID</w:t>
+        <w:t xml:space="preserve">    JOIN t ON p.AIRPLANE_TYPE_ID = t.AIRPLANE_TYPE_ID</w:t>
         <w:br/>
         <w:t xml:space="preserve">    GROUP BY a.AIRLINE_NAME, p.AIRPLANE_ID, t.NAME</w:t>
         <w:br/>
@@ -856,38 +792,37 @@
         <w:br/>
         <w:t>""")</w:t>
         <w:br/>
-        <w:br/>
-        <w:t>print("=== CONSULTA 1: Voos no Brasil por companhia/aeronave ===")</w:t>
-        <w:br/>
         <w:t>consulta1.show()</w:t>
-        <w:br/>
-        <w:br/>
-        <w:t># =============================================================================</w:t>
-        <w:br/>
-        <w:t># CONSULTA 2: Voos para Nova York (ter/qua/qui) no mês de aniversário</w:t>
-        <w:br/>
-        <w:t># =============================================================================</w:t>
-        <w:br/>
-        <w:t># Equivalente à consulta (ii) da Fase 1.</w:t>
-        <w:br/>
-        <w:t># dayofweek(): 1=Domingo, 2=Segunda, 3=Terça, 4=Quarta, 5=Quinta.</w:t>
-        <w:br/>
-        <w:t># month() = 6 corresponde a junho (mês de aniversário do autor).</w:t>
-        <w:br/>
-        <w:br/>
+      </w:r>
+    </w:p>
+    <w:p>
+      <w:pPr>
+        <w:pStyle w:val="Heading2"/>
+      </w:pPr>
+      <w:r>
+        <w:t>4.3 Consulta 2 — Voos para Nova York</w:t>
+      </w:r>
+    </w:p>
+    <w:p>
+      <w:r>
+        <w:t>Lista voos com destino NEW YORK às terças, quartas ou quintas em junho.</w:t>
+      </w:r>
+    </w:p>
+    <w:p>
+      <w:r>
+        <w:rPr>
+          <w:rFonts w:ascii="Courier New" w:hAnsi="Courier New"/>
+          <w:sz w:val="18"/>
+        </w:rPr>
         <w:t>consulta2 = spark.sql("""</w:t>
         <w:br/>
-        <w:t xml:space="preserve">    SELECT</w:t>
-        <w:br/>
-        <w:t xml:space="preserve">        a.AIRLINE_NAME,</w:t>
-        <w:br/>
-        <w:t xml:space="preserve">        f.DEPARTURE</w:t>
+        <w:t xml:space="preserve">    SELECT a.AIRLINE_NAME, f.DEPARTURE</w:t>
         <w:br/>
         <w:t xml:space="preserve">    FROM f</w:t>
         <w:br/>
         <w:t xml:space="preserve">    JOIN g ON f.TO_AIRPORT_ID = g.AIRPORT_ID</w:t>
         <w:br/>
-        <w:t xml:space="preserve">    JOIN a ON f.AIRLINE_ID    = a.AIRLINE_ID</w:t>
+        <w:t xml:space="preserve">    JOIN a ON f.AIRLINE_ID = a.AIRLINE_ID</w:t>
         <w:br/>
         <w:t xml:space="preserve">    WHERE g.CITY = 'NEW YORK'</w:t>
         <w:br/>
@@ -897,45 +832,39 @@
         <w:br/>
         <w:t>""")</w:t>
         <w:br/>
-        <w:br/>
-        <w:t>print("=== CONSULTA 2: Voos para NY em ter/qua/qui (junho) ===")</w:t>
-        <w:br/>
         <w:t>consulta2.show()</w:t>
-        <w:br/>
-        <w:br/>
-        <w:t># =============================================================================</w:t>
-        <w:br/>
-        <w:t># CONSULTA 3: Top 5 rotas internacionais mais movimentadas</w:t>
-        <w:br/>
-        <w:t># =============================================================================</w:t>
-        <w:br/>
-        <w:t># Self-join em AIR_AIRPORTS_GEO para obter país de origem e destino.</w:t>
-        <w:br/>
-        <w:t># Filtra rotas onde origem != destino (internacionais).</w:t>
-        <w:br/>
-        <w:t># Ordena por volume e limita ao top 5.</w:t>
-        <w:br/>
-        <w:br/>
-        <w:t>geo.createOrReplaceTempView("geo_origem")</w:t>
-        <w:br/>
-        <w:t>geo.createOrReplaceTempView("geo_destino")</w:t>
-        <w:br/>
-        <w:br/>
+      </w:r>
+    </w:p>
+    <w:p>
+      <w:pPr>
+        <w:pStyle w:val="Heading2"/>
+      </w:pPr>
+      <w:r>
+        <w:t>4.4 Consulta 3 — Top 5 rotas internacionais</w:t>
+      </w:r>
+    </w:p>
+    <w:p>
+      <w:r>
+        <w:t>Retorna as 5 rotas entre países diferentes com mais voos.</w:t>
+      </w:r>
+    </w:p>
+    <w:p>
+      <w:r>
+        <w:rPr>
+          <w:rFonts w:ascii="Courier New" w:hAnsi="Courier New"/>
+          <w:sz w:val="18"/>
+        </w:rPr>
         <w:t>consulta3 = spark.sql("""</w:t>
         <w:br/>
-        <w:t xml:space="preserve">    SELECT</w:t>
+        <w:t xml:space="preserve">    SELECT go.COUNTRY AS PAIS_ORIGEM, gd.COUNTRY AS PAIS_DESTINO,</w:t>
         <w:br/>
-        <w:t xml:space="preserve">        go.COUNTRY AS PAIS_ORIGEM,</w:t>
-        <w:br/>
-        <w:t xml:space="preserve">        gd.COUNTRY AS PAIS_DESTINO,</w:t>
-        <w:br/>
-        <w:t xml:space="preserve">        COUNT(f.FLIGHT_ID) AS TOTAL_VOOS</w:t>
+        <w:t xml:space="preserve">           COUNT(f.FLIGHT_ID) AS TOTAL_VOOS</w:t>
         <w:br/>
         <w:t xml:space="preserve">    FROM f</w:t>
         <w:br/>
-        <w:t xml:space="preserve">    JOIN geo_origem  go ON f.FROM_AIRPORT_ID = go.AIRPORT_ID</w:t>
+        <w:t xml:space="preserve">    JOIN g go ON f.FROM_AIRPORT_ID = go.AIRPORT_ID</w:t>
         <w:br/>
-        <w:t xml:space="preserve">    JOIN geo_destino gd ON f.TO_AIRPORT_ID   = gd.AIRPORT_ID</w:t>
+        <w:t xml:space="preserve">    JOIN g gd ON f.TO_AIRPORT_ID   = gd.AIRPORT_ID</w:t>
         <w:br/>
         <w:t xml:space="preserve">    WHERE go.COUNTRY &lt;&gt; gd.COUNTRY</w:t>
         <w:br/>
@@ -947,109 +876,10 @@
         <w:br/>
         <w:t>""")</w:t>
         <w:br/>
-        <w:br/>
-        <w:t>print("=== CONSULTA 3: Top 5 rotas internacionais ===")</w:t>
-        <w:br/>
         <w:t>consulta3.show()</w:t>
         <w:br/>
         <w:br/>
-        <w:t># -----------------------------------------------------------------------------</w:t>
-        <w:br/>
-        <w:t># Encerramento da sessão Spark</w:t>
-        <w:br/>
-        <w:t># -----------------------------------------------------------------------------</w:t>
-        <w:br/>
         <w:t>spark.stop()</w:t>
-      </w:r>
-    </w:p>
-    <w:p>
-      <w:pPr>
-        <w:pStyle w:val="Heading2"/>
-      </w:pPr>
-      <w:r>
-        <w:t>4.2 Versão alternativa da Consulta 1 (API DataFrame)</w:t>
-      </w:r>
-    </w:p>
-    <w:p>
-      <w:r>
-        <w:rPr>
-          <w:rFonts w:ascii="Courier New" w:hAnsi="Courier New"/>
-          <w:sz w:val="18"/>
-        </w:rPr>
-        <w:t># Mesma lógica da Consulta 1, usando a API DataFrame em vez de Spark SQL</w:t>
-        <w:br/>
-        <w:t>from pyspark.sql.functions import count as spark_count</w:t>
-        <w:br/>
-        <w:br/>
-        <w:t>g_origem = geo.alias("g1")</w:t>
-        <w:br/>
-        <w:t>g_destino = geo.alias("g2")</w:t>
-        <w:br/>
-        <w:br/>
-        <w:t>consulta1_df = (</w:t>
-        <w:br/>
-        <w:t xml:space="preserve">    flights</w:t>
-        <w:br/>
-        <w:t xml:space="preserve">    .join(g_origem,   (col("FROM_AIRPORT_ID") == col("g1.AIRPORT_ID")) &amp; (col("g1.COUNTRY") == "BRAZIL"))</w:t>
-        <w:br/>
-        <w:t xml:space="preserve">    .join(g_destino,  (col("TO_AIRPORT_ID")   == col("g2.AIRPORT_ID")) &amp; (col("g2.COUNTRY") == "BRAZIL"))</w:t>
-        <w:br/>
-        <w:t xml:space="preserve">    .join(airlines,   "AIRLINE_ID")</w:t>
-        <w:br/>
-        <w:t xml:space="preserve">    .join(airplanes,  airlines["AIRLINE_ID"] == airplanes["AIRLINE_ID"])</w:t>
-        <w:br/>
-        <w:t xml:space="preserve">    .join(types,      airplanes["AIRPLANE_TYPE_ID"] == types["AIRPLANE_TYPE_ID"])</w:t>
-        <w:br/>
-        <w:t xml:space="preserve">    .groupBy("AIRLINE_NAME", "AIRPLANE_ID", "NAME")</w:t>
-        <w:br/>
-        <w:t xml:space="preserve">    .agg(spark_count("FLIGHT_ID").alias("NUM_VOOS"))</w:t>
-        <w:br/>
-        <w:t xml:space="preserve">    .orderBy(col("NUM_VOOS").desc())</w:t>
-        <w:br/>
-        <w:t>)</w:t>
-        <w:br/>
-        <w:br/>
-        <w:t>consulta1_df.show()</w:t>
-      </w:r>
-    </w:p>
-    <w:p>
-      <w:pPr>
-        <w:pStyle w:val="Heading1"/>
-      </w:pPr>
-      <w:r>
-        <w:t>Observações para adaptar ao seu ambiente</w:t>
-      </w:r>
-    </w:p>
-    <w:p>
-      <w:pPr>
-        <w:pStyle w:val="ListBullet"/>
-      </w:pPr>
-      <w:r>
-        <w:t>Senha e URL JDBC: Use os valores do docker-compose.yml do repositório OtimizacaoConsultas (host, porta, service name XEPDB1 ou SID XE).</w:t>
-      </w:r>
-    </w:p>
-    <w:p>
-      <w:pPr>
-        <w:pStyle w:val="ListBullet"/>
-      </w:pPr>
-      <w:r>
-        <w:t>Consulta 2: Se junho não retornar linhas, altere month(f.DEPARTURE) = 6 para o mês seguinte, como na Fase 1.</w:t>
-      </w:r>
-    </w:p>
-    <w:p>
-      <w:pPr>
-        <w:pStyle w:val="ListBullet"/>
-      </w:pPr>
-      <w:r>
-        <w:t>Item 4 "(Fase 1)": Trate como scripts Spark da Fase 2; se o professor quiser também os SQL originais da Fase 1, eles já estão no PDF entregue.</w:t>
-      </w:r>
-    </w:p>
-    <w:p>
-      <w:pPr>
-        <w:pStyle w:val="ListBullet"/>
-      </w:pPr>
-      <w:r>
-        <w:t>Capturas de tela: Inclua saída do show() no terminal/Jupyter e, se possível, o Spark UI (localhost:4040) mostrando os estágios das consultas.</w:t>
       </w:r>
     </w:p>
     <w:sectPr>

</xml_diff>